<commit_message>
feat(PhysicalWeight): 条重汇总表支持 oz/dozen 第三格(模板扩至 9 列)
- 模板表0 汇总网格 8→9 格新增 oz/dozen 列; Layout SummaryCellCount 8→9, 条重列 {6,7,8}
- 引擎填值/格式化数组化(条重 F4×3), Service 汇总行加 Value3(条重取 OzPerDozen 均值)
- DTO/FillModel 增 OzPerDozen / Value3
</commit_message>
<xml_diff>
--- a/wwwroot/DocxModel/Common_PHY/PHY_Weight.docx
+++ b/wwwroot/DocxModel/Common_PHY/PHY_Weight.docx
@@ -25,31 +25,35 @@
     </w:p>
     <w:tbl>
       <w:tblPr>
-        <w:tblW w:w="10490" w:type="dxa"/>
+        <w:tblW w:w="11340" w:type="dxa"/>
         <w:jc w:val="center"/>
         <w:tblLayout w:type="fixed"/>
         <w:tblLook w:val="04A0" w:firstRow="1" w:lastRow="0" w:firstColumn="1" w:lastColumn="0" w:noHBand="0" w:noVBand="1"/>
       </w:tblPr>
       <w:tblGrid>
-        <w:gridCol w:w="1701"/>
+        <w:gridCol w:w="142"/>
+        <w:gridCol w:w="1559"/>
         <w:gridCol w:w="709"/>
         <w:gridCol w:w="425"/>
-        <w:gridCol w:w="993"/>
-        <w:gridCol w:w="1133"/>
-        <w:gridCol w:w="993"/>
-        <w:gridCol w:w="2268"/>
+        <w:gridCol w:w="1134"/>
+        <w:gridCol w:w="1134"/>
+        <w:gridCol w:w="1134"/>
+        <w:gridCol w:w="1701"/>
+        <w:gridCol w:w="1134"/>
         <w:gridCol w:w="1134"/>
         <w:gridCol w:w="1134"/>
       </w:tblGrid>
       <w:tr>
         <w:trPr>
+          <w:gridAfter w:val="1"/>
+          <w:wAfter w:w="1134" w:type="dxa"/>
           <w:trHeight w:val="171"/>
           <w:jc w:val="center"/>
         </w:trPr>
         <w:tc>
           <w:tcPr>
             <w:tcW w:w="2410" w:type="dxa"/>
-            <w:gridSpan w:val="2"/>
+            <w:gridSpan w:val="3"/>
             <w:vAlign w:val="center"/>
           </w:tcPr>
           <w:p>
@@ -68,7 +72,7 @@
                 <w:sz w:val="24"/>
                 <w:szCs w:val="24"/>
               </w:rPr>
-              <w:t xml:space="preserve">Test Report </w:t>
+              <w:t>Test Report</w:t>
             </w:r>
             <w:r>
               <w:rPr>
@@ -76,13 +80,13 @@
                 <w:sz w:val="24"/>
                 <w:szCs w:val="24"/>
               </w:rPr>
-              <w:t>Number</w:t>
+              <w:t xml:space="preserve"> Number</w:t>
             </w:r>
           </w:p>
         </w:tc>
         <w:tc>
           <w:tcPr>
-            <w:tcW w:w="8080" w:type="dxa"/>
+            <w:tcW w:w="7796" w:type="dxa"/>
             <w:gridSpan w:val="7"/>
           </w:tcPr>
           <w:p>
@@ -101,12 +105,16 @@
       </w:tr>
       <w:tr>
         <w:trPr>
+          <w:gridBefore w:val="1"/>
+          <w:gridAfter w:val="1"/>
+          <w:wBefore w:w="142" w:type="dxa"/>
+          <w:wAfter w:w="1134" w:type="dxa"/>
           <w:trHeight w:val="191"/>
           <w:jc w:val="center"/>
         </w:trPr>
         <w:tc>
           <w:tcPr>
-            <w:tcW w:w="10490" w:type="dxa"/>
+            <w:tcW w:w="10064" w:type="dxa"/>
             <w:gridSpan w:val="9"/>
             <w:shd w:val="thinDiagCross" w:color="D9D9D9" w:themeColor="background1" w:themeShade="D9" w:fill="FFFFFF" w:themeFill="background1"/>
           </w:tcPr>
@@ -125,12 +133,16 @@
       </w:tr>
       <w:tr>
         <w:trPr>
+          <w:gridBefore w:val="1"/>
+          <w:gridAfter w:val="1"/>
+          <w:wBefore w:w="142" w:type="dxa"/>
+          <w:wAfter w:w="1134" w:type="dxa"/>
           <w:trHeight w:val="191"/>
           <w:jc w:val="center"/>
         </w:trPr>
         <w:tc>
           <w:tcPr>
-            <w:tcW w:w="10490" w:type="dxa"/>
+            <w:tcW w:w="10064" w:type="dxa"/>
             <w:gridSpan w:val="9"/>
           </w:tcPr>
           <w:p>
@@ -148,12 +160,16 @@
       </w:tr>
       <w:tr>
         <w:trPr>
+          <w:gridBefore w:val="1"/>
+          <w:gridAfter w:val="1"/>
+          <w:wBefore w:w="142" w:type="dxa"/>
+          <w:wAfter w:w="1134" w:type="dxa"/>
           <w:trHeight w:val="191"/>
           <w:jc w:val="center"/>
         </w:trPr>
         <w:tc>
           <w:tcPr>
-            <w:tcW w:w="10490" w:type="dxa"/>
+            <w:tcW w:w="10064" w:type="dxa"/>
             <w:gridSpan w:val="9"/>
           </w:tcPr>
           <w:p>
@@ -173,28 +189,23 @@
                 <w:bCs/>
                 <w:u w:val="single"/>
               </w:rPr>
-              <w:t xml:space="preserve">Fabric Weight Per Unit </w:t>
-            </w:r>
-            <w:r>
-              <w:rPr>
-                <w:rFonts w:ascii="Arial" w:hAnsi="Arial" w:cs="Arial" w:hint="eastAsia"/>
-                <w:b/>
-                <w:bCs/>
-                <w:u w:val="single"/>
-              </w:rPr>
-              <w:t>Area</w:t>
+              <w:t>Fabric Weight Per Unit Area</w:t>
             </w:r>
           </w:p>
         </w:tc>
       </w:tr>
       <w:tr>
         <w:trPr>
+          <w:gridBefore w:val="1"/>
+          <w:gridAfter w:val="1"/>
+          <w:wBefore w:w="142" w:type="dxa"/>
+          <w:wAfter w:w="1134" w:type="dxa"/>
           <w:trHeight w:val="113"/>
           <w:jc w:val="center"/>
         </w:trPr>
         <w:tc>
           <w:tcPr>
-            <w:tcW w:w="10490" w:type="dxa"/>
+            <w:tcW w:w="10064" w:type="dxa"/>
             <w:gridSpan w:val="9"/>
           </w:tcPr>
           <w:p>
@@ -214,12 +225,16 @@
       </w:tr>
       <w:tr>
         <w:trPr>
+          <w:gridBefore w:val="1"/>
+          <w:gridAfter w:val="1"/>
+          <w:wBefore w:w="142" w:type="dxa"/>
+          <w:wAfter w:w="1134" w:type="dxa"/>
           <w:trHeight w:val="191"/>
           <w:jc w:val="center"/>
         </w:trPr>
         <w:tc>
           <w:tcPr>
-            <w:tcW w:w="1701" w:type="dxa"/>
+            <w:tcW w:w="1559" w:type="dxa"/>
           </w:tcPr>
           <w:p>
             <w:pPr>
@@ -245,7 +260,7 @@
         </w:tc>
         <w:tc>
           <w:tcPr>
-            <w:tcW w:w="8789" w:type="dxa"/>
+            <w:tcW w:w="8505" w:type="dxa"/>
             <w:gridSpan w:val="8"/>
           </w:tcPr>
           <w:p>
@@ -298,13 +313,30 @@
       </w:tr>
       <w:tr>
         <w:trPr>
+          <w:gridBefore w:val="1"/>
+          <w:wBefore w:w="142" w:type="dxa"/>
           <w:trHeight w:val="191"/>
           <w:jc w:val="center"/>
         </w:trPr>
         <w:tc>
           <w:tcPr>
-            <w:tcW w:w="10490" w:type="dxa"/>
+            <w:tcW w:w="10064" w:type="dxa"/>
             <w:gridSpan w:val="9"/>
+          </w:tcPr>
+          <w:p>
+            <w:pPr>
+              <w:spacing w:after="0" w:line="240" w:lineRule="auto"/>
+              <w:rPr>
+                <w:rFonts w:ascii="Arial" w:eastAsia="黑体" w:hAnsi="Arial" w:cs="Arial"/>
+                <w:sz w:val="13"/>
+                <w:szCs w:val="13"/>
+              </w:rPr>
+            </w:pPr>
+          </w:p>
+        </w:tc>
+        <w:tc>
+          <w:tcPr>
+            <w:tcW w:w="1134" w:type="dxa"/>
           </w:tcPr>
           <w:p>
             <w:pPr>
@@ -320,12 +352,14 @@
       </w:tr>
       <w:tr>
         <w:trPr>
+          <w:gridBefore w:val="1"/>
+          <w:wBefore w:w="142" w:type="dxa"/>
           <w:trHeight w:val="191"/>
           <w:jc w:val="center"/>
         </w:trPr>
         <w:tc>
           <w:tcPr>
-            <w:tcW w:w="1701" w:type="dxa"/>
+            <w:tcW w:w="1559" w:type="dxa"/>
           </w:tcPr>
           <w:p>
             <w:pPr>
@@ -396,7 +430,7 @@
         </w:tc>
         <w:tc>
           <w:tcPr>
-            <w:tcW w:w="993" w:type="dxa"/>
+            <w:tcW w:w="1134" w:type="dxa"/>
           </w:tcPr>
           <w:p>
             <w:pPr>
@@ -442,7 +476,7 @@
         </w:tc>
         <w:tc>
           <w:tcPr>
-            <w:tcW w:w="1133" w:type="dxa"/>
+            <w:tcW w:w="1134" w:type="dxa"/>
           </w:tcPr>
           <w:p>
             <w:pPr>
@@ -467,7 +501,7 @@
         </w:tc>
         <w:tc>
           <w:tcPr>
-            <w:tcW w:w="993" w:type="dxa"/>
+            <w:tcW w:w="1134" w:type="dxa"/>
           </w:tcPr>
           <w:p>
             <w:pPr>
@@ -492,7 +526,7 @@
         </w:tc>
         <w:tc>
           <w:tcPr>
-            <w:tcW w:w="2268" w:type="dxa"/>
+            <w:tcW w:w="1701" w:type="dxa"/>
           </w:tcPr>
           <w:p>
             <w:pPr>
@@ -536,7 +570,7 @@
                 <w:sz w:val="20"/>
                 <w:szCs w:val="20"/>
               </w:rPr>
-              <w:t xml:space="preserve">(g/piece </w:t>
+              <w:t>(g/piece</w:t>
             </w:r>
           </w:p>
         </w:tc>
@@ -562,16 +596,7 @@
                 <w:sz w:val="20"/>
                 <w:szCs w:val="20"/>
               </w:rPr>
-              <w:t>l</w:t>
-            </w:r>
-            <w:r>
-              <w:rPr>
-                <w:rFonts w:ascii="Arial" w:eastAsia="黑体" w:hAnsi="Arial" w:cs="Arial" w:hint="eastAsia"/>
-                <w:color w:val="538135" w:themeColor="accent6" w:themeShade="BF"/>
-                <w:sz w:val="20"/>
-                <w:szCs w:val="20"/>
-              </w:rPr>
-              <w:t>b</w:t>
+              <w:t>lb</w:t>
             </w:r>
             <w:proofErr w:type="spellEnd"/>
             <w:r>
@@ -581,19 +606,47 @@
                 <w:sz w:val="20"/>
                 <w:szCs w:val="20"/>
               </w:rPr>
-              <w:t>/dozen)</w:t>
+              <w:t>/dozen</w:t>
+            </w:r>
+          </w:p>
+        </w:tc>
+        <w:tc>
+          <w:tcPr>
+            <w:tcW w:w="1134" w:type="dxa"/>
+          </w:tcPr>
+          <w:p>
+            <w:pPr>
+              <w:spacing w:after="0" w:line="240" w:lineRule="auto"/>
+              <w:jc w:val="center"/>
+              <w:rPr>
+                <w:rFonts w:ascii="Arial" w:eastAsia="黑体" w:hAnsi="Arial" w:cs="Arial"/>
+                <w:color w:val="538135" w:themeColor="accent6" w:themeShade="BF"/>
+                <w:sz w:val="20"/>
+                <w:szCs w:val="20"/>
+              </w:rPr>
+            </w:pPr>
+            <w:r>
+              <w:rPr>
+                <w:rFonts w:ascii="Arial" w:eastAsia="黑体" w:hAnsi="Arial" w:cs="Arial" w:hint="eastAsia"/>
+                <w:color w:val="538135" w:themeColor="accent6" w:themeShade="BF"/>
+                <w:sz w:val="20"/>
+                <w:szCs w:val="20"/>
+              </w:rPr>
+              <w:t>oz/dozen)</w:t>
             </w:r>
           </w:p>
         </w:tc>
       </w:tr>
       <w:tr>
         <w:trPr>
+          <w:gridBefore w:val="1"/>
+          <w:wBefore w:w="142" w:type="dxa"/>
           <w:trHeight w:val="138"/>
           <w:jc w:val="center"/>
         </w:trPr>
         <w:tc>
           <w:tcPr>
-            <w:tcW w:w="1701" w:type="dxa"/>
+            <w:tcW w:w="1559" w:type="dxa"/>
           </w:tcPr>
           <w:p>
             <w:pPr>
@@ -626,55 +679,71 @@
         </w:tc>
         <w:tc>
           <w:tcPr>
-            <w:tcW w:w="993" w:type="dxa"/>
-          </w:tcPr>
-          <w:p>
-            <w:pPr>
-              <w:spacing w:after="0" w:line="240" w:lineRule="auto"/>
-              <w:jc w:val="center"/>
-              <w:rPr>
-                <w:rFonts w:ascii="Arial" w:eastAsia="黑体" w:hAnsi="Arial" w:cs="Arial"/>
-                <w:sz w:val="20"/>
-                <w:szCs w:val="20"/>
-              </w:rPr>
-            </w:pPr>
-          </w:p>
-        </w:tc>
-        <w:tc>
-          <w:tcPr>
-            <w:tcW w:w="1133" w:type="dxa"/>
-          </w:tcPr>
-          <w:p>
-            <w:pPr>
-              <w:spacing w:after="0" w:line="240" w:lineRule="auto"/>
-              <w:jc w:val="center"/>
-              <w:rPr>
-                <w:rFonts w:ascii="Arial" w:eastAsia="黑体" w:hAnsi="Arial" w:cs="Arial"/>
-                <w:sz w:val="20"/>
-                <w:szCs w:val="20"/>
-              </w:rPr>
-            </w:pPr>
-          </w:p>
-        </w:tc>
-        <w:tc>
-          <w:tcPr>
-            <w:tcW w:w="993" w:type="dxa"/>
-          </w:tcPr>
-          <w:p>
-            <w:pPr>
-              <w:spacing w:after="0" w:line="240" w:lineRule="auto"/>
-              <w:jc w:val="center"/>
-              <w:rPr>
-                <w:rFonts w:ascii="Arial" w:eastAsia="黑体" w:hAnsi="Arial" w:cs="Arial"/>
-                <w:sz w:val="20"/>
-                <w:szCs w:val="20"/>
-              </w:rPr>
-            </w:pPr>
-          </w:p>
-        </w:tc>
-        <w:tc>
-          <w:tcPr>
-            <w:tcW w:w="2268" w:type="dxa"/>
+            <w:tcW w:w="1134" w:type="dxa"/>
+          </w:tcPr>
+          <w:p>
+            <w:pPr>
+              <w:spacing w:after="0" w:line="240" w:lineRule="auto"/>
+              <w:jc w:val="center"/>
+              <w:rPr>
+                <w:rFonts w:ascii="Arial" w:eastAsia="黑体" w:hAnsi="Arial" w:cs="Arial"/>
+                <w:sz w:val="20"/>
+                <w:szCs w:val="20"/>
+              </w:rPr>
+            </w:pPr>
+          </w:p>
+        </w:tc>
+        <w:tc>
+          <w:tcPr>
+            <w:tcW w:w="1134" w:type="dxa"/>
+          </w:tcPr>
+          <w:p>
+            <w:pPr>
+              <w:spacing w:after="0" w:line="240" w:lineRule="auto"/>
+              <w:jc w:val="center"/>
+              <w:rPr>
+                <w:rFonts w:ascii="Arial" w:eastAsia="黑体" w:hAnsi="Arial" w:cs="Arial"/>
+                <w:sz w:val="20"/>
+                <w:szCs w:val="20"/>
+              </w:rPr>
+            </w:pPr>
+          </w:p>
+        </w:tc>
+        <w:tc>
+          <w:tcPr>
+            <w:tcW w:w="1134" w:type="dxa"/>
+          </w:tcPr>
+          <w:p>
+            <w:pPr>
+              <w:spacing w:after="0" w:line="240" w:lineRule="auto"/>
+              <w:jc w:val="center"/>
+              <w:rPr>
+                <w:rFonts w:ascii="Arial" w:eastAsia="黑体" w:hAnsi="Arial" w:cs="Arial"/>
+                <w:sz w:val="20"/>
+                <w:szCs w:val="20"/>
+              </w:rPr>
+            </w:pPr>
+          </w:p>
+        </w:tc>
+        <w:tc>
+          <w:tcPr>
+            <w:tcW w:w="1701" w:type="dxa"/>
+          </w:tcPr>
+          <w:p>
+            <w:pPr>
+              <w:spacing w:after="0" w:line="240" w:lineRule="auto"/>
+              <w:jc w:val="center"/>
+              <w:rPr>
+                <w:rFonts w:ascii="Arial" w:eastAsia="黑体" w:hAnsi="Arial" w:cs="Arial"/>
+                <w:sz w:val="20"/>
+                <w:szCs w:val="20"/>
+              </w:rPr>
+            </w:pPr>
+          </w:p>
+        </w:tc>
+        <w:tc>
+          <w:tcPr>
+            <w:tcW w:w="1134" w:type="dxa"/>
           </w:tcPr>
           <w:p>
             <w:pPr>
@@ -723,12 +792,14 @@
       </w:tr>
       <w:tr>
         <w:trPr>
+          <w:gridBefore w:val="1"/>
+          <w:wBefore w:w="142" w:type="dxa"/>
           <w:trHeight w:val="136"/>
           <w:jc w:val="center"/>
         </w:trPr>
         <w:tc>
           <w:tcPr>
-            <w:tcW w:w="1701" w:type="dxa"/>
+            <w:tcW w:w="1559" w:type="dxa"/>
           </w:tcPr>
           <w:p>
             <w:pPr>
@@ -761,55 +832,71 @@
         </w:tc>
         <w:tc>
           <w:tcPr>
-            <w:tcW w:w="993" w:type="dxa"/>
-          </w:tcPr>
-          <w:p>
-            <w:pPr>
-              <w:spacing w:after="0" w:line="240" w:lineRule="auto"/>
-              <w:jc w:val="center"/>
-              <w:rPr>
-                <w:rFonts w:ascii="Arial" w:eastAsia="黑体" w:hAnsi="Arial" w:cs="Arial"/>
-                <w:sz w:val="20"/>
-                <w:szCs w:val="20"/>
-              </w:rPr>
-            </w:pPr>
-          </w:p>
-        </w:tc>
-        <w:tc>
-          <w:tcPr>
-            <w:tcW w:w="1133" w:type="dxa"/>
-          </w:tcPr>
-          <w:p>
-            <w:pPr>
-              <w:spacing w:after="0" w:line="240" w:lineRule="auto"/>
-              <w:jc w:val="center"/>
-              <w:rPr>
-                <w:rFonts w:ascii="Arial" w:eastAsia="黑体" w:hAnsi="Arial" w:cs="Arial"/>
-                <w:sz w:val="20"/>
-                <w:szCs w:val="20"/>
-              </w:rPr>
-            </w:pPr>
-          </w:p>
-        </w:tc>
-        <w:tc>
-          <w:tcPr>
-            <w:tcW w:w="993" w:type="dxa"/>
-          </w:tcPr>
-          <w:p>
-            <w:pPr>
-              <w:spacing w:after="0" w:line="240" w:lineRule="auto"/>
-              <w:jc w:val="center"/>
-              <w:rPr>
-                <w:rFonts w:ascii="Arial" w:eastAsia="黑体" w:hAnsi="Arial" w:cs="Arial"/>
-                <w:sz w:val="20"/>
-                <w:szCs w:val="20"/>
-              </w:rPr>
-            </w:pPr>
-          </w:p>
-        </w:tc>
-        <w:tc>
-          <w:tcPr>
-            <w:tcW w:w="2268" w:type="dxa"/>
+            <w:tcW w:w="1134" w:type="dxa"/>
+          </w:tcPr>
+          <w:p>
+            <w:pPr>
+              <w:spacing w:after="0" w:line="240" w:lineRule="auto"/>
+              <w:jc w:val="center"/>
+              <w:rPr>
+                <w:rFonts w:ascii="Arial" w:eastAsia="黑体" w:hAnsi="Arial" w:cs="Arial"/>
+                <w:sz w:val="20"/>
+                <w:szCs w:val="20"/>
+              </w:rPr>
+            </w:pPr>
+          </w:p>
+        </w:tc>
+        <w:tc>
+          <w:tcPr>
+            <w:tcW w:w="1134" w:type="dxa"/>
+          </w:tcPr>
+          <w:p>
+            <w:pPr>
+              <w:spacing w:after="0" w:line="240" w:lineRule="auto"/>
+              <w:jc w:val="center"/>
+              <w:rPr>
+                <w:rFonts w:ascii="Arial" w:eastAsia="黑体" w:hAnsi="Arial" w:cs="Arial"/>
+                <w:sz w:val="20"/>
+                <w:szCs w:val="20"/>
+              </w:rPr>
+            </w:pPr>
+          </w:p>
+        </w:tc>
+        <w:tc>
+          <w:tcPr>
+            <w:tcW w:w="1134" w:type="dxa"/>
+          </w:tcPr>
+          <w:p>
+            <w:pPr>
+              <w:spacing w:after="0" w:line="240" w:lineRule="auto"/>
+              <w:jc w:val="center"/>
+              <w:rPr>
+                <w:rFonts w:ascii="Arial" w:eastAsia="黑体" w:hAnsi="Arial" w:cs="Arial"/>
+                <w:sz w:val="20"/>
+                <w:szCs w:val="20"/>
+              </w:rPr>
+            </w:pPr>
+          </w:p>
+        </w:tc>
+        <w:tc>
+          <w:tcPr>
+            <w:tcW w:w="1701" w:type="dxa"/>
+          </w:tcPr>
+          <w:p>
+            <w:pPr>
+              <w:spacing w:after="0" w:line="240" w:lineRule="auto"/>
+              <w:jc w:val="center"/>
+              <w:rPr>
+                <w:rFonts w:ascii="Arial" w:eastAsia="黑体" w:hAnsi="Arial" w:cs="Arial"/>
+                <w:sz w:val="20"/>
+                <w:szCs w:val="20"/>
+              </w:rPr>
+            </w:pPr>
+          </w:p>
+        </w:tc>
+        <w:tc>
+          <w:tcPr>
+            <w:tcW w:w="1134" w:type="dxa"/>
           </w:tcPr>
           <w:p>
             <w:pPr>
@@ -858,12 +945,14 @@
       </w:tr>
       <w:tr>
         <w:trPr>
+          <w:gridBefore w:val="1"/>
+          <w:wBefore w:w="142" w:type="dxa"/>
           <w:trHeight w:val="136"/>
           <w:jc w:val="center"/>
         </w:trPr>
         <w:tc>
           <w:tcPr>
-            <w:tcW w:w="1701" w:type="dxa"/>
+            <w:tcW w:w="1559" w:type="dxa"/>
           </w:tcPr>
           <w:p>
             <w:pPr>
@@ -896,55 +985,71 @@
         </w:tc>
         <w:tc>
           <w:tcPr>
-            <w:tcW w:w="993" w:type="dxa"/>
-          </w:tcPr>
-          <w:p>
-            <w:pPr>
-              <w:spacing w:after="0" w:line="240" w:lineRule="auto"/>
-              <w:jc w:val="center"/>
-              <w:rPr>
-                <w:rFonts w:ascii="Arial" w:eastAsia="黑体" w:hAnsi="Arial" w:cs="Arial"/>
-                <w:sz w:val="20"/>
-                <w:szCs w:val="20"/>
-              </w:rPr>
-            </w:pPr>
-          </w:p>
-        </w:tc>
-        <w:tc>
-          <w:tcPr>
-            <w:tcW w:w="1133" w:type="dxa"/>
-          </w:tcPr>
-          <w:p>
-            <w:pPr>
-              <w:spacing w:after="0" w:line="240" w:lineRule="auto"/>
-              <w:jc w:val="center"/>
-              <w:rPr>
-                <w:rFonts w:ascii="Arial" w:eastAsia="黑体" w:hAnsi="Arial" w:cs="Arial"/>
-                <w:sz w:val="20"/>
-                <w:szCs w:val="20"/>
-              </w:rPr>
-            </w:pPr>
-          </w:p>
-        </w:tc>
-        <w:tc>
-          <w:tcPr>
-            <w:tcW w:w="993" w:type="dxa"/>
-          </w:tcPr>
-          <w:p>
-            <w:pPr>
-              <w:spacing w:after="0" w:line="240" w:lineRule="auto"/>
-              <w:jc w:val="center"/>
-              <w:rPr>
-                <w:rFonts w:ascii="Arial" w:eastAsia="黑体" w:hAnsi="Arial" w:cs="Arial"/>
-                <w:sz w:val="20"/>
-                <w:szCs w:val="20"/>
-              </w:rPr>
-            </w:pPr>
-          </w:p>
-        </w:tc>
-        <w:tc>
-          <w:tcPr>
-            <w:tcW w:w="2268" w:type="dxa"/>
+            <w:tcW w:w="1134" w:type="dxa"/>
+          </w:tcPr>
+          <w:p>
+            <w:pPr>
+              <w:spacing w:after="0" w:line="240" w:lineRule="auto"/>
+              <w:jc w:val="center"/>
+              <w:rPr>
+                <w:rFonts w:ascii="Arial" w:eastAsia="黑体" w:hAnsi="Arial" w:cs="Arial"/>
+                <w:sz w:val="20"/>
+                <w:szCs w:val="20"/>
+              </w:rPr>
+            </w:pPr>
+          </w:p>
+        </w:tc>
+        <w:tc>
+          <w:tcPr>
+            <w:tcW w:w="1134" w:type="dxa"/>
+          </w:tcPr>
+          <w:p>
+            <w:pPr>
+              <w:spacing w:after="0" w:line="240" w:lineRule="auto"/>
+              <w:jc w:val="center"/>
+              <w:rPr>
+                <w:rFonts w:ascii="Arial" w:eastAsia="黑体" w:hAnsi="Arial" w:cs="Arial"/>
+                <w:sz w:val="20"/>
+                <w:szCs w:val="20"/>
+              </w:rPr>
+            </w:pPr>
+          </w:p>
+        </w:tc>
+        <w:tc>
+          <w:tcPr>
+            <w:tcW w:w="1134" w:type="dxa"/>
+          </w:tcPr>
+          <w:p>
+            <w:pPr>
+              <w:spacing w:after="0" w:line="240" w:lineRule="auto"/>
+              <w:jc w:val="center"/>
+              <w:rPr>
+                <w:rFonts w:ascii="Arial" w:eastAsia="黑体" w:hAnsi="Arial" w:cs="Arial"/>
+                <w:sz w:val="20"/>
+                <w:szCs w:val="20"/>
+              </w:rPr>
+            </w:pPr>
+          </w:p>
+        </w:tc>
+        <w:tc>
+          <w:tcPr>
+            <w:tcW w:w="1701" w:type="dxa"/>
+          </w:tcPr>
+          <w:p>
+            <w:pPr>
+              <w:spacing w:after="0" w:line="240" w:lineRule="auto"/>
+              <w:jc w:val="center"/>
+              <w:rPr>
+                <w:rFonts w:ascii="Arial" w:eastAsia="黑体" w:hAnsi="Arial" w:cs="Arial"/>
+                <w:sz w:val="20"/>
+                <w:szCs w:val="20"/>
+              </w:rPr>
+            </w:pPr>
+          </w:p>
+        </w:tc>
+        <w:tc>
+          <w:tcPr>
+            <w:tcW w:w="1134" w:type="dxa"/>
           </w:tcPr>
           <w:p>
             <w:pPr>
@@ -993,12 +1098,14 @@
       </w:tr>
       <w:tr>
         <w:trPr>
+          <w:gridBefore w:val="1"/>
+          <w:wBefore w:w="142" w:type="dxa"/>
           <w:trHeight w:val="136"/>
           <w:jc w:val="center"/>
         </w:trPr>
         <w:tc>
           <w:tcPr>
-            <w:tcW w:w="1701" w:type="dxa"/>
+            <w:tcW w:w="1559" w:type="dxa"/>
           </w:tcPr>
           <w:p>
             <w:pPr>
@@ -1031,55 +1138,71 @@
         </w:tc>
         <w:tc>
           <w:tcPr>
-            <w:tcW w:w="993" w:type="dxa"/>
-          </w:tcPr>
-          <w:p>
-            <w:pPr>
-              <w:spacing w:after="0" w:line="240" w:lineRule="auto"/>
-              <w:jc w:val="center"/>
-              <w:rPr>
-                <w:rFonts w:ascii="Arial" w:eastAsia="黑体" w:hAnsi="Arial" w:cs="Arial"/>
-                <w:sz w:val="20"/>
-                <w:szCs w:val="20"/>
-              </w:rPr>
-            </w:pPr>
-          </w:p>
-        </w:tc>
-        <w:tc>
-          <w:tcPr>
-            <w:tcW w:w="1133" w:type="dxa"/>
-          </w:tcPr>
-          <w:p>
-            <w:pPr>
-              <w:spacing w:after="0" w:line="240" w:lineRule="auto"/>
-              <w:jc w:val="center"/>
-              <w:rPr>
-                <w:rFonts w:ascii="Arial" w:eastAsia="黑体" w:hAnsi="Arial" w:cs="Arial"/>
-                <w:sz w:val="20"/>
-                <w:szCs w:val="20"/>
-              </w:rPr>
-            </w:pPr>
-          </w:p>
-        </w:tc>
-        <w:tc>
-          <w:tcPr>
-            <w:tcW w:w="993" w:type="dxa"/>
-          </w:tcPr>
-          <w:p>
-            <w:pPr>
-              <w:spacing w:after="0" w:line="240" w:lineRule="auto"/>
-              <w:jc w:val="center"/>
-              <w:rPr>
-                <w:rFonts w:ascii="Arial" w:eastAsia="黑体" w:hAnsi="Arial" w:cs="Arial"/>
-                <w:sz w:val="20"/>
-                <w:szCs w:val="20"/>
-              </w:rPr>
-            </w:pPr>
-          </w:p>
-        </w:tc>
-        <w:tc>
-          <w:tcPr>
-            <w:tcW w:w="2268" w:type="dxa"/>
+            <w:tcW w:w="1134" w:type="dxa"/>
+          </w:tcPr>
+          <w:p>
+            <w:pPr>
+              <w:spacing w:after="0" w:line="240" w:lineRule="auto"/>
+              <w:jc w:val="center"/>
+              <w:rPr>
+                <w:rFonts w:ascii="Arial" w:eastAsia="黑体" w:hAnsi="Arial" w:cs="Arial"/>
+                <w:sz w:val="20"/>
+                <w:szCs w:val="20"/>
+              </w:rPr>
+            </w:pPr>
+          </w:p>
+        </w:tc>
+        <w:tc>
+          <w:tcPr>
+            <w:tcW w:w="1134" w:type="dxa"/>
+          </w:tcPr>
+          <w:p>
+            <w:pPr>
+              <w:spacing w:after="0" w:line="240" w:lineRule="auto"/>
+              <w:jc w:val="center"/>
+              <w:rPr>
+                <w:rFonts w:ascii="Arial" w:eastAsia="黑体" w:hAnsi="Arial" w:cs="Arial"/>
+                <w:sz w:val="20"/>
+                <w:szCs w:val="20"/>
+              </w:rPr>
+            </w:pPr>
+          </w:p>
+        </w:tc>
+        <w:tc>
+          <w:tcPr>
+            <w:tcW w:w="1134" w:type="dxa"/>
+          </w:tcPr>
+          <w:p>
+            <w:pPr>
+              <w:spacing w:after="0" w:line="240" w:lineRule="auto"/>
+              <w:jc w:val="center"/>
+              <w:rPr>
+                <w:rFonts w:ascii="Arial" w:eastAsia="黑体" w:hAnsi="Arial" w:cs="Arial"/>
+                <w:sz w:val="20"/>
+                <w:szCs w:val="20"/>
+              </w:rPr>
+            </w:pPr>
+          </w:p>
+        </w:tc>
+        <w:tc>
+          <w:tcPr>
+            <w:tcW w:w="1701" w:type="dxa"/>
+          </w:tcPr>
+          <w:p>
+            <w:pPr>
+              <w:spacing w:after="0" w:line="240" w:lineRule="auto"/>
+              <w:jc w:val="center"/>
+              <w:rPr>
+                <w:rFonts w:ascii="Arial" w:eastAsia="黑体" w:hAnsi="Arial" w:cs="Arial"/>
+                <w:sz w:val="20"/>
+                <w:szCs w:val="20"/>
+              </w:rPr>
+            </w:pPr>
+          </w:p>
+        </w:tc>
+        <w:tc>
+          <w:tcPr>
+            <w:tcW w:w="1134" w:type="dxa"/>
           </w:tcPr>
           <w:p>
             <w:pPr>
@@ -1128,12 +1251,14 @@
       </w:tr>
       <w:tr>
         <w:trPr>
+          <w:gridBefore w:val="1"/>
+          <w:wBefore w:w="142" w:type="dxa"/>
           <w:trHeight w:val="136"/>
           <w:jc w:val="center"/>
         </w:trPr>
         <w:tc>
           <w:tcPr>
-            <w:tcW w:w="1701" w:type="dxa"/>
+            <w:tcW w:w="1559" w:type="dxa"/>
           </w:tcPr>
           <w:p>
             <w:pPr>
@@ -1166,55 +1291,71 @@
         </w:tc>
         <w:tc>
           <w:tcPr>
-            <w:tcW w:w="993" w:type="dxa"/>
-          </w:tcPr>
-          <w:p>
-            <w:pPr>
-              <w:spacing w:after="0" w:line="240" w:lineRule="auto"/>
-              <w:jc w:val="center"/>
-              <w:rPr>
-                <w:rFonts w:ascii="Arial" w:eastAsia="黑体" w:hAnsi="Arial" w:cs="Arial"/>
-                <w:sz w:val="20"/>
-                <w:szCs w:val="20"/>
-              </w:rPr>
-            </w:pPr>
-          </w:p>
-        </w:tc>
-        <w:tc>
-          <w:tcPr>
-            <w:tcW w:w="1133" w:type="dxa"/>
-          </w:tcPr>
-          <w:p>
-            <w:pPr>
-              <w:spacing w:after="0" w:line="240" w:lineRule="auto"/>
-              <w:jc w:val="center"/>
-              <w:rPr>
-                <w:rFonts w:ascii="Arial" w:eastAsia="黑体" w:hAnsi="Arial" w:cs="Arial"/>
-                <w:sz w:val="20"/>
-                <w:szCs w:val="20"/>
-              </w:rPr>
-            </w:pPr>
-          </w:p>
-        </w:tc>
-        <w:tc>
-          <w:tcPr>
-            <w:tcW w:w="993" w:type="dxa"/>
-          </w:tcPr>
-          <w:p>
-            <w:pPr>
-              <w:spacing w:after="0" w:line="240" w:lineRule="auto"/>
-              <w:jc w:val="center"/>
-              <w:rPr>
-                <w:rFonts w:ascii="Arial" w:eastAsia="黑体" w:hAnsi="Arial" w:cs="Arial"/>
-                <w:sz w:val="20"/>
-                <w:szCs w:val="20"/>
-              </w:rPr>
-            </w:pPr>
-          </w:p>
-        </w:tc>
-        <w:tc>
-          <w:tcPr>
-            <w:tcW w:w="2268" w:type="dxa"/>
+            <w:tcW w:w="1134" w:type="dxa"/>
+          </w:tcPr>
+          <w:p>
+            <w:pPr>
+              <w:spacing w:after="0" w:line="240" w:lineRule="auto"/>
+              <w:jc w:val="center"/>
+              <w:rPr>
+                <w:rFonts w:ascii="Arial" w:eastAsia="黑体" w:hAnsi="Arial" w:cs="Arial"/>
+                <w:sz w:val="20"/>
+                <w:szCs w:val="20"/>
+              </w:rPr>
+            </w:pPr>
+          </w:p>
+        </w:tc>
+        <w:tc>
+          <w:tcPr>
+            <w:tcW w:w="1134" w:type="dxa"/>
+          </w:tcPr>
+          <w:p>
+            <w:pPr>
+              <w:spacing w:after="0" w:line="240" w:lineRule="auto"/>
+              <w:jc w:val="center"/>
+              <w:rPr>
+                <w:rFonts w:ascii="Arial" w:eastAsia="黑体" w:hAnsi="Arial" w:cs="Arial"/>
+                <w:sz w:val="20"/>
+                <w:szCs w:val="20"/>
+              </w:rPr>
+            </w:pPr>
+          </w:p>
+        </w:tc>
+        <w:tc>
+          <w:tcPr>
+            <w:tcW w:w="1134" w:type="dxa"/>
+          </w:tcPr>
+          <w:p>
+            <w:pPr>
+              <w:spacing w:after="0" w:line="240" w:lineRule="auto"/>
+              <w:jc w:val="center"/>
+              <w:rPr>
+                <w:rFonts w:ascii="Arial" w:eastAsia="黑体" w:hAnsi="Arial" w:cs="Arial"/>
+                <w:sz w:val="20"/>
+                <w:szCs w:val="20"/>
+              </w:rPr>
+            </w:pPr>
+          </w:p>
+        </w:tc>
+        <w:tc>
+          <w:tcPr>
+            <w:tcW w:w="1701" w:type="dxa"/>
+          </w:tcPr>
+          <w:p>
+            <w:pPr>
+              <w:spacing w:after="0" w:line="240" w:lineRule="auto"/>
+              <w:jc w:val="center"/>
+              <w:rPr>
+                <w:rFonts w:ascii="Arial" w:eastAsia="黑体" w:hAnsi="Arial" w:cs="Arial"/>
+                <w:sz w:val="20"/>
+                <w:szCs w:val="20"/>
+              </w:rPr>
+            </w:pPr>
+          </w:p>
+        </w:tc>
+        <w:tc>
+          <w:tcPr>
+            <w:tcW w:w="1134" w:type="dxa"/>
           </w:tcPr>
           <w:p>
             <w:pPr>
@@ -1263,12 +1404,14 @@
       </w:tr>
       <w:tr>
         <w:trPr>
+          <w:gridBefore w:val="1"/>
+          <w:wBefore w:w="142" w:type="dxa"/>
           <w:trHeight w:val="136"/>
           <w:jc w:val="center"/>
         </w:trPr>
         <w:tc>
           <w:tcPr>
-            <w:tcW w:w="1701" w:type="dxa"/>
+            <w:tcW w:w="1559" w:type="dxa"/>
           </w:tcPr>
           <w:p>
             <w:pPr>
@@ -1301,55 +1444,71 @@
         </w:tc>
         <w:tc>
           <w:tcPr>
-            <w:tcW w:w="993" w:type="dxa"/>
-          </w:tcPr>
-          <w:p>
-            <w:pPr>
-              <w:spacing w:after="0" w:line="240" w:lineRule="auto"/>
-              <w:jc w:val="center"/>
-              <w:rPr>
-                <w:rFonts w:ascii="Arial" w:eastAsia="黑体" w:hAnsi="Arial" w:cs="Arial"/>
-                <w:sz w:val="20"/>
-                <w:szCs w:val="20"/>
-              </w:rPr>
-            </w:pPr>
-          </w:p>
-        </w:tc>
-        <w:tc>
-          <w:tcPr>
-            <w:tcW w:w="1133" w:type="dxa"/>
-          </w:tcPr>
-          <w:p>
-            <w:pPr>
-              <w:spacing w:after="0" w:line="240" w:lineRule="auto"/>
-              <w:jc w:val="center"/>
-              <w:rPr>
-                <w:rFonts w:ascii="Arial" w:eastAsia="黑体" w:hAnsi="Arial" w:cs="Arial"/>
-                <w:sz w:val="20"/>
-                <w:szCs w:val="20"/>
-              </w:rPr>
-            </w:pPr>
-          </w:p>
-        </w:tc>
-        <w:tc>
-          <w:tcPr>
-            <w:tcW w:w="993" w:type="dxa"/>
-          </w:tcPr>
-          <w:p>
-            <w:pPr>
-              <w:spacing w:after="0" w:line="240" w:lineRule="auto"/>
-              <w:jc w:val="center"/>
-              <w:rPr>
-                <w:rFonts w:ascii="Arial" w:eastAsia="黑体" w:hAnsi="Arial" w:cs="Arial"/>
-                <w:sz w:val="20"/>
-                <w:szCs w:val="20"/>
-              </w:rPr>
-            </w:pPr>
-          </w:p>
-        </w:tc>
-        <w:tc>
-          <w:tcPr>
-            <w:tcW w:w="2268" w:type="dxa"/>
+            <w:tcW w:w="1134" w:type="dxa"/>
+          </w:tcPr>
+          <w:p>
+            <w:pPr>
+              <w:spacing w:after="0" w:line="240" w:lineRule="auto"/>
+              <w:jc w:val="center"/>
+              <w:rPr>
+                <w:rFonts w:ascii="Arial" w:eastAsia="黑体" w:hAnsi="Arial" w:cs="Arial"/>
+                <w:sz w:val="20"/>
+                <w:szCs w:val="20"/>
+              </w:rPr>
+            </w:pPr>
+          </w:p>
+        </w:tc>
+        <w:tc>
+          <w:tcPr>
+            <w:tcW w:w="1134" w:type="dxa"/>
+          </w:tcPr>
+          <w:p>
+            <w:pPr>
+              <w:spacing w:after="0" w:line="240" w:lineRule="auto"/>
+              <w:jc w:val="center"/>
+              <w:rPr>
+                <w:rFonts w:ascii="Arial" w:eastAsia="黑体" w:hAnsi="Arial" w:cs="Arial"/>
+                <w:sz w:val="20"/>
+                <w:szCs w:val="20"/>
+              </w:rPr>
+            </w:pPr>
+          </w:p>
+        </w:tc>
+        <w:tc>
+          <w:tcPr>
+            <w:tcW w:w="1134" w:type="dxa"/>
+          </w:tcPr>
+          <w:p>
+            <w:pPr>
+              <w:spacing w:after="0" w:line="240" w:lineRule="auto"/>
+              <w:jc w:val="center"/>
+              <w:rPr>
+                <w:rFonts w:ascii="Arial" w:eastAsia="黑体" w:hAnsi="Arial" w:cs="Arial"/>
+                <w:sz w:val="20"/>
+                <w:szCs w:val="20"/>
+              </w:rPr>
+            </w:pPr>
+          </w:p>
+        </w:tc>
+        <w:tc>
+          <w:tcPr>
+            <w:tcW w:w="1701" w:type="dxa"/>
+          </w:tcPr>
+          <w:p>
+            <w:pPr>
+              <w:spacing w:after="0" w:line="240" w:lineRule="auto"/>
+              <w:jc w:val="center"/>
+              <w:rPr>
+                <w:rFonts w:ascii="Arial" w:eastAsia="黑体" w:hAnsi="Arial" w:cs="Arial"/>
+                <w:sz w:val="20"/>
+                <w:szCs w:val="20"/>
+              </w:rPr>
+            </w:pPr>
+          </w:p>
+        </w:tc>
+        <w:tc>
+          <w:tcPr>
+            <w:tcW w:w="1134" w:type="dxa"/>
           </w:tcPr>
           <w:p>
             <w:pPr>

</xml_diff>

<commit_message>
chore(PhysicalWeight): 修改 PHY_Weight 克重报告模板
</commit_message>
<xml_diff>
--- a/wwwroot/DocxModel/Common_PHY/PHY_Weight.docx
+++ b/wwwroot/DocxModel/Common_PHY/PHY_Weight.docx
@@ -25,17 +25,16 @@
     </w:p>
     <w:tbl>
       <w:tblPr>
-        <w:tblW w:w="11340" w:type="dxa"/>
+        <w:tblW w:w="10772" w:type="dxa"/>
         <w:jc w:val="center"/>
         <w:tblLayout w:type="fixed"/>
         <w:tblLook w:val="04A0" w:firstRow="1" w:lastRow="0" w:firstColumn="1" w:lastColumn="0" w:noHBand="0" w:noVBand="1"/>
       </w:tblPr>
       <w:tblGrid>
-        <w:gridCol w:w="142"/>
-        <w:gridCol w:w="1559"/>
-        <w:gridCol w:w="709"/>
-        <w:gridCol w:w="425"/>
+        <w:gridCol w:w="1133"/>
         <w:gridCol w:w="1134"/>
+        <w:gridCol w:w="285"/>
+        <w:gridCol w:w="849"/>
         <w:gridCol w:w="1134"/>
         <w:gridCol w:w="1134"/>
         <w:gridCol w:w="1701"/>
@@ -52,7 +51,7 @@
         </w:trPr>
         <w:tc>
           <w:tcPr>
-            <w:tcW w:w="2410" w:type="dxa"/>
+            <w:tcW w:w="2552" w:type="dxa"/>
             <w:gridSpan w:val="3"/>
             <w:vAlign w:val="center"/>
           </w:tcPr>
@@ -86,8 +85,8 @@
         </w:tc>
         <w:tc>
           <w:tcPr>
-            <w:tcW w:w="7796" w:type="dxa"/>
-            <w:gridSpan w:val="7"/>
+            <w:tcW w:w="7086" w:type="dxa"/>
+            <w:gridSpan w:val="6"/>
           </w:tcPr>
           <w:p>
             <w:pPr>
@@ -105,16 +104,14 @@
       </w:tr>
       <w:tr>
         <w:trPr>
-          <w:gridBefore w:val="1"/>
           <w:gridAfter w:val="1"/>
-          <w:wBefore w:w="142" w:type="dxa"/>
           <w:wAfter w:w="1134" w:type="dxa"/>
           <w:trHeight w:val="191"/>
           <w:jc w:val="center"/>
         </w:trPr>
         <w:tc>
           <w:tcPr>
-            <w:tcW w:w="10064" w:type="dxa"/>
+            <w:tcW w:w="9638" w:type="dxa"/>
             <w:gridSpan w:val="9"/>
             <w:shd w:val="thinDiagCross" w:color="D9D9D9" w:themeColor="background1" w:themeShade="D9" w:fill="FFFFFF" w:themeFill="background1"/>
           </w:tcPr>
@@ -133,16 +130,14 @@
       </w:tr>
       <w:tr>
         <w:trPr>
-          <w:gridBefore w:val="1"/>
           <w:gridAfter w:val="1"/>
-          <w:wBefore w:w="142" w:type="dxa"/>
           <w:wAfter w:w="1134" w:type="dxa"/>
           <w:trHeight w:val="191"/>
           <w:jc w:val="center"/>
         </w:trPr>
         <w:tc>
           <w:tcPr>
-            <w:tcW w:w="10064" w:type="dxa"/>
+            <w:tcW w:w="9638" w:type="dxa"/>
             <w:gridSpan w:val="9"/>
           </w:tcPr>
           <w:p>
@@ -160,16 +155,14 @@
       </w:tr>
       <w:tr>
         <w:trPr>
-          <w:gridBefore w:val="1"/>
           <w:gridAfter w:val="1"/>
-          <w:wBefore w:w="142" w:type="dxa"/>
           <w:wAfter w:w="1134" w:type="dxa"/>
           <w:trHeight w:val="191"/>
           <w:jc w:val="center"/>
         </w:trPr>
         <w:tc>
           <w:tcPr>
-            <w:tcW w:w="10064" w:type="dxa"/>
+            <w:tcW w:w="9638" w:type="dxa"/>
             <w:gridSpan w:val="9"/>
           </w:tcPr>
           <w:p>
@@ -196,16 +189,14 @@
       </w:tr>
       <w:tr>
         <w:trPr>
-          <w:gridBefore w:val="1"/>
           <w:gridAfter w:val="1"/>
-          <w:wBefore w:w="142" w:type="dxa"/>
           <w:wAfter w:w="1134" w:type="dxa"/>
           <w:trHeight w:val="113"/>
           <w:jc w:val="center"/>
         </w:trPr>
         <w:tc>
           <w:tcPr>
-            <w:tcW w:w="10064" w:type="dxa"/>
+            <w:tcW w:w="9638" w:type="dxa"/>
             <w:gridSpan w:val="9"/>
           </w:tcPr>
           <w:p>
@@ -225,16 +216,14 @@
       </w:tr>
       <w:tr>
         <w:trPr>
-          <w:gridBefore w:val="1"/>
           <w:gridAfter w:val="1"/>
-          <w:wBefore w:w="142" w:type="dxa"/>
           <w:wAfter w:w="1134" w:type="dxa"/>
           <w:trHeight w:val="191"/>
           <w:jc w:val="center"/>
         </w:trPr>
         <w:tc>
           <w:tcPr>
-            <w:tcW w:w="1559" w:type="dxa"/>
+            <w:tcW w:w="1133" w:type="dxa"/>
           </w:tcPr>
           <w:p>
             <w:pPr>
@@ -313,14 +302,12 @@
       </w:tr>
       <w:tr>
         <w:trPr>
-          <w:gridBefore w:val="1"/>
-          <w:wBefore w:w="142" w:type="dxa"/>
           <w:trHeight w:val="191"/>
           <w:jc w:val="center"/>
         </w:trPr>
         <w:tc>
           <w:tcPr>
-            <w:tcW w:w="10064" w:type="dxa"/>
+            <w:tcW w:w="9638" w:type="dxa"/>
             <w:gridSpan w:val="9"/>
           </w:tcPr>
           <w:p>
@@ -352,14 +339,12 @@
       </w:tr>
       <w:tr>
         <w:trPr>
-          <w:gridBefore w:val="1"/>
-          <w:wBefore w:w="142" w:type="dxa"/>
           <w:trHeight w:val="191"/>
           <w:jc w:val="center"/>
         </w:trPr>
         <w:tc>
           <w:tcPr>
-            <w:tcW w:w="1559" w:type="dxa"/>
+            <w:tcW w:w="1133" w:type="dxa"/>
           </w:tcPr>
           <w:p>
             <w:pPr>
@@ -386,7 +371,6 @@
         <w:tc>
           <w:tcPr>
             <w:tcW w:w="1134" w:type="dxa"/>
-            <w:gridSpan w:val="2"/>
           </w:tcPr>
           <w:p>
             <w:pPr>
@@ -431,6 +415,7 @@
         <w:tc>
           <w:tcPr>
             <w:tcW w:w="1134" w:type="dxa"/>
+            <w:gridSpan w:val="2"/>
           </w:tcPr>
           <w:p>
             <w:pPr>
@@ -639,14 +624,28 @@
       </w:tr>
       <w:tr>
         <w:trPr>
-          <w:gridBefore w:val="1"/>
-          <w:wBefore w:w="142" w:type="dxa"/>
           <w:trHeight w:val="138"/>
           <w:jc w:val="center"/>
         </w:trPr>
         <w:tc>
           <w:tcPr>
-            <w:tcW w:w="1559" w:type="dxa"/>
+            <w:tcW w:w="1133" w:type="dxa"/>
+          </w:tcPr>
+          <w:p>
+            <w:pPr>
+              <w:spacing w:after="0" w:line="240" w:lineRule="auto"/>
+              <w:jc w:val="center"/>
+              <w:rPr>
+                <w:rFonts w:ascii="Arial" w:eastAsia="黑体" w:hAnsi="Arial" w:cs="Arial"/>
+                <w:sz w:val="20"/>
+                <w:szCs w:val="20"/>
+              </w:rPr>
+            </w:pPr>
+          </w:p>
+        </w:tc>
+        <w:tc>
+          <w:tcPr>
+            <w:tcW w:w="1134" w:type="dxa"/>
           </w:tcPr>
           <w:p>
             <w:pPr>
@@ -664,22 +663,6 @@
           <w:tcPr>
             <w:tcW w:w="1134" w:type="dxa"/>
             <w:gridSpan w:val="2"/>
-          </w:tcPr>
-          <w:p>
-            <w:pPr>
-              <w:spacing w:after="0" w:line="240" w:lineRule="auto"/>
-              <w:jc w:val="center"/>
-              <w:rPr>
-                <w:rFonts w:ascii="Arial" w:eastAsia="黑体" w:hAnsi="Arial" w:cs="Arial"/>
-                <w:sz w:val="20"/>
-                <w:szCs w:val="20"/>
-              </w:rPr>
-            </w:pPr>
-          </w:p>
-        </w:tc>
-        <w:tc>
-          <w:tcPr>
-            <w:tcW w:w="1134" w:type="dxa"/>
           </w:tcPr>
           <w:p>
             <w:pPr>
@@ -792,14 +775,28 @@
       </w:tr>
       <w:tr>
         <w:trPr>
-          <w:gridBefore w:val="1"/>
-          <w:wBefore w:w="142" w:type="dxa"/>
           <w:trHeight w:val="136"/>
           <w:jc w:val="center"/>
         </w:trPr>
         <w:tc>
           <w:tcPr>
-            <w:tcW w:w="1559" w:type="dxa"/>
+            <w:tcW w:w="1133" w:type="dxa"/>
+          </w:tcPr>
+          <w:p>
+            <w:pPr>
+              <w:spacing w:after="0" w:line="240" w:lineRule="auto"/>
+              <w:jc w:val="center"/>
+              <w:rPr>
+                <w:rFonts w:ascii="Arial" w:eastAsia="黑体" w:hAnsi="Arial" w:cs="Arial"/>
+                <w:sz w:val="20"/>
+                <w:szCs w:val="20"/>
+              </w:rPr>
+            </w:pPr>
+          </w:p>
+        </w:tc>
+        <w:tc>
+          <w:tcPr>
+            <w:tcW w:w="1134" w:type="dxa"/>
           </w:tcPr>
           <w:p>
             <w:pPr>
@@ -817,22 +814,6 @@
           <w:tcPr>
             <w:tcW w:w="1134" w:type="dxa"/>
             <w:gridSpan w:val="2"/>
-          </w:tcPr>
-          <w:p>
-            <w:pPr>
-              <w:spacing w:after="0" w:line="240" w:lineRule="auto"/>
-              <w:jc w:val="center"/>
-              <w:rPr>
-                <w:rFonts w:ascii="Arial" w:eastAsia="黑体" w:hAnsi="Arial" w:cs="Arial"/>
-                <w:sz w:val="20"/>
-                <w:szCs w:val="20"/>
-              </w:rPr>
-            </w:pPr>
-          </w:p>
-        </w:tc>
-        <w:tc>
-          <w:tcPr>
-            <w:tcW w:w="1134" w:type="dxa"/>
           </w:tcPr>
           <w:p>
             <w:pPr>
@@ -945,14 +926,28 @@
       </w:tr>
       <w:tr>
         <w:trPr>
-          <w:gridBefore w:val="1"/>
-          <w:wBefore w:w="142" w:type="dxa"/>
           <w:trHeight w:val="136"/>
           <w:jc w:val="center"/>
         </w:trPr>
         <w:tc>
           <w:tcPr>
-            <w:tcW w:w="1559" w:type="dxa"/>
+            <w:tcW w:w="1133" w:type="dxa"/>
+          </w:tcPr>
+          <w:p>
+            <w:pPr>
+              <w:spacing w:after="0" w:line="240" w:lineRule="auto"/>
+              <w:jc w:val="center"/>
+              <w:rPr>
+                <w:rFonts w:ascii="Arial" w:eastAsia="黑体" w:hAnsi="Arial" w:cs="Arial"/>
+                <w:sz w:val="20"/>
+                <w:szCs w:val="20"/>
+              </w:rPr>
+            </w:pPr>
+          </w:p>
+        </w:tc>
+        <w:tc>
+          <w:tcPr>
+            <w:tcW w:w="1134" w:type="dxa"/>
           </w:tcPr>
           <w:p>
             <w:pPr>
@@ -970,22 +965,6 @@
           <w:tcPr>
             <w:tcW w:w="1134" w:type="dxa"/>
             <w:gridSpan w:val="2"/>
-          </w:tcPr>
-          <w:p>
-            <w:pPr>
-              <w:spacing w:after="0" w:line="240" w:lineRule="auto"/>
-              <w:jc w:val="center"/>
-              <w:rPr>
-                <w:rFonts w:ascii="Arial" w:eastAsia="黑体" w:hAnsi="Arial" w:cs="Arial"/>
-                <w:sz w:val="20"/>
-                <w:szCs w:val="20"/>
-              </w:rPr>
-            </w:pPr>
-          </w:p>
-        </w:tc>
-        <w:tc>
-          <w:tcPr>
-            <w:tcW w:w="1134" w:type="dxa"/>
           </w:tcPr>
           <w:p>
             <w:pPr>
@@ -1098,14 +1077,28 @@
       </w:tr>
       <w:tr>
         <w:trPr>
-          <w:gridBefore w:val="1"/>
-          <w:wBefore w:w="142" w:type="dxa"/>
           <w:trHeight w:val="136"/>
           <w:jc w:val="center"/>
         </w:trPr>
         <w:tc>
           <w:tcPr>
-            <w:tcW w:w="1559" w:type="dxa"/>
+            <w:tcW w:w="1133" w:type="dxa"/>
+          </w:tcPr>
+          <w:p>
+            <w:pPr>
+              <w:spacing w:after="0" w:line="240" w:lineRule="auto"/>
+              <w:jc w:val="center"/>
+              <w:rPr>
+                <w:rFonts w:ascii="Arial" w:eastAsia="黑体" w:hAnsi="Arial" w:cs="Arial"/>
+                <w:sz w:val="20"/>
+                <w:szCs w:val="20"/>
+              </w:rPr>
+            </w:pPr>
+          </w:p>
+        </w:tc>
+        <w:tc>
+          <w:tcPr>
+            <w:tcW w:w="1134" w:type="dxa"/>
           </w:tcPr>
           <w:p>
             <w:pPr>
@@ -1123,22 +1116,6 @@
           <w:tcPr>
             <w:tcW w:w="1134" w:type="dxa"/>
             <w:gridSpan w:val="2"/>
-          </w:tcPr>
-          <w:p>
-            <w:pPr>
-              <w:spacing w:after="0" w:line="240" w:lineRule="auto"/>
-              <w:jc w:val="center"/>
-              <w:rPr>
-                <w:rFonts w:ascii="Arial" w:eastAsia="黑体" w:hAnsi="Arial" w:cs="Arial"/>
-                <w:sz w:val="20"/>
-                <w:szCs w:val="20"/>
-              </w:rPr>
-            </w:pPr>
-          </w:p>
-        </w:tc>
-        <w:tc>
-          <w:tcPr>
-            <w:tcW w:w="1134" w:type="dxa"/>
           </w:tcPr>
           <w:p>
             <w:pPr>
@@ -1251,14 +1228,28 @@
       </w:tr>
       <w:tr>
         <w:trPr>
-          <w:gridBefore w:val="1"/>
-          <w:wBefore w:w="142" w:type="dxa"/>
           <w:trHeight w:val="136"/>
           <w:jc w:val="center"/>
         </w:trPr>
         <w:tc>
           <w:tcPr>
-            <w:tcW w:w="1559" w:type="dxa"/>
+            <w:tcW w:w="1133" w:type="dxa"/>
+          </w:tcPr>
+          <w:p>
+            <w:pPr>
+              <w:spacing w:after="0" w:line="240" w:lineRule="auto"/>
+              <w:jc w:val="center"/>
+              <w:rPr>
+                <w:rFonts w:ascii="Arial" w:eastAsia="黑体" w:hAnsi="Arial" w:cs="Arial"/>
+                <w:sz w:val="20"/>
+                <w:szCs w:val="20"/>
+              </w:rPr>
+            </w:pPr>
+          </w:p>
+        </w:tc>
+        <w:tc>
+          <w:tcPr>
+            <w:tcW w:w="1134" w:type="dxa"/>
           </w:tcPr>
           <w:p>
             <w:pPr>
@@ -1276,22 +1267,6 @@
           <w:tcPr>
             <w:tcW w:w="1134" w:type="dxa"/>
             <w:gridSpan w:val="2"/>
-          </w:tcPr>
-          <w:p>
-            <w:pPr>
-              <w:spacing w:after="0" w:line="240" w:lineRule="auto"/>
-              <w:jc w:val="center"/>
-              <w:rPr>
-                <w:rFonts w:ascii="Arial" w:eastAsia="黑体" w:hAnsi="Arial" w:cs="Arial"/>
-                <w:sz w:val="20"/>
-                <w:szCs w:val="20"/>
-              </w:rPr>
-            </w:pPr>
-          </w:p>
-        </w:tc>
-        <w:tc>
-          <w:tcPr>
-            <w:tcW w:w="1134" w:type="dxa"/>
           </w:tcPr>
           <w:p>
             <w:pPr>
@@ -1404,14 +1379,28 @@
       </w:tr>
       <w:tr>
         <w:trPr>
-          <w:gridBefore w:val="1"/>
-          <w:wBefore w:w="142" w:type="dxa"/>
           <w:trHeight w:val="136"/>
           <w:jc w:val="center"/>
         </w:trPr>
         <w:tc>
           <w:tcPr>
-            <w:tcW w:w="1559" w:type="dxa"/>
+            <w:tcW w:w="1133" w:type="dxa"/>
+          </w:tcPr>
+          <w:p>
+            <w:pPr>
+              <w:spacing w:after="0" w:line="240" w:lineRule="auto"/>
+              <w:jc w:val="center"/>
+              <w:rPr>
+                <w:rFonts w:ascii="Arial" w:eastAsia="黑体" w:hAnsi="Arial" w:cs="Arial"/>
+                <w:sz w:val="20"/>
+                <w:szCs w:val="20"/>
+              </w:rPr>
+            </w:pPr>
+          </w:p>
+        </w:tc>
+        <w:tc>
+          <w:tcPr>
+            <w:tcW w:w="1134" w:type="dxa"/>
           </w:tcPr>
           <w:p>
             <w:pPr>
@@ -1429,22 +1418,6 @@
           <w:tcPr>
             <w:tcW w:w="1134" w:type="dxa"/>
             <w:gridSpan w:val="2"/>
-          </w:tcPr>
-          <w:p>
-            <w:pPr>
-              <w:spacing w:after="0" w:line="240" w:lineRule="auto"/>
-              <w:jc w:val="center"/>
-              <w:rPr>
-                <w:rFonts w:ascii="Arial" w:eastAsia="黑体" w:hAnsi="Arial" w:cs="Arial"/>
-                <w:sz w:val="20"/>
-                <w:szCs w:val="20"/>
-              </w:rPr>
-            </w:pPr>
-          </w:p>
-        </w:tc>
-        <w:tc>
-          <w:tcPr>
-            <w:tcW w:w="1134" w:type="dxa"/>
           </w:tcPr>
           <w:p>
             <w:pPr>

</xml_diff>